<commit_message>
feat: implement mailer configuration, admin dashboard, and core frontend navigation components while rebranding project to CipherNest
</commit_message>
<xml_diff>
--- a/OEL[Adbms Report].docx
+++ b/OEL[Adbms Report].docx
@@ -23,7 +23,14 @@
           <w:b/>
           <w:sz w:val="27"/>
         </w:rPr>
-        <w:t>CSC-204</w:t>
+        <w:t>CSC-20</w:t>
+      </w:r>
+      <w:r>
+        <w:rPr>
+          <w:b/>
+          <w:sz w:val="27"/>
+        </w:rPr>
+        <w:t>1L</w:t>
       </w:r>
       <w:r>
         <w:rPr>
@@ -6509,6 +6516,9 @@
     </w:p>
     <w:p>
       <w:r>
+        <w:rPr>
+          <w:noProof/>
+        </w:rPr>
         <w:drawing>
           <wp:inline distT="0" distB="0" distL="0" distR="0" wp14:anchorId="6AA95D96" wp14:editId="14A83070">
             <wp:extent cx="5731510" cy="3069590"/>
@@ -6686,6 +6696,9 @@
     </w:p>
     <w:p>
       <w:r>
+        <w:rPr>
+          <w:noProof/>
+        </w:rPr>
         <w:drawing>
           <wp:anchor distT="0" distB="0" distL="114300" distR="114300" simplePos="0" relativeHeight="251659264" behindDoc="0" locked="0" layoutInCell="1" allowOverlap="1" wp14:anchorId="691CC01B" wp14:editId="15E7F764">
             <wp:simplePos x="0" y="0"/>
@@ -8088,6 +8101,7 @@
       </w:pPr>
       <w:r>
         <w:rPr>
+          <w:noProof/>
           <w:lang w:val="en-PK"/>
         </w:rPr>
         <w:drawing>
@@ -8185,6 +8199,7 @@
       </w:pPr>
       <w:r>
         <w:rPr>
+          <w:noProof/>
           <w:lang w:val="en-PK"/>
         </w:rPr>
         <w:drawing>
@@ -8282,6 +8297,7 @@
       </w:pPr>
       <w:r>
         <w:rPr>
+          <w:noProof/>
           <w:lang w:val="en-PK"/>
         </w:rPr>
         <w:drawing>
@@ -8379,6 +8395,7 @@
       </w:pPr>
       <w:r>
         <w:rPr>
+          <w:noProof/>
           <w:lang w:val="en-PK"/>
         </w:rPr>
         <w:drawing>
@@ -10460,6 +10477,7 @@
         <w:rPr>
           <w:lang w:val="en-PK"/>
         </w:rPr>
+        <w:lastRenderedPageBreak/>
         <w:t>Performance and Resource Evaluation</w:t>
       </w:r>
       <w:bookmarkEnd w:id="38"/>
@@ -11624,6 +11642,7 @@
       </w:pPr>
       <w:bookmarkStart w:id="40" w:name="_Toc231720947"/>
       <w:r>
+        <w:lastRenderedPageBreak/>
         <w:t>Security recommendations</w:t>
       </w:r>
       <w:bookmarkEnd w:id="40"/>
@@ -11796,7 +11815,6 @@
         <w:rPr>
           <w:lang w:val="en-PK"/>
         </w:rPr>
-        <w:lastRenderedPageBreak/>
         <w:t>API Rate Limiting and Intrusion Detection</w:t>
       </w:r>
       <w:bookmarkEnd w:id="43"/>
@@ -11855,6 +11873,7 @@
         <w:rPr>
           <w:lang w:val="en-PK"/>
         </w:rPr>
+        <w:lastRenderedPageBreak/>
         <w:t>Immutable Audit Logging</w:t>
       </w:r>
       <w:bookmarkEnd w:id="44"/>
@@ -12043,7 +12062,6 @@
           <w:bCs/>
           <w:lang w:val="en-PK"/>
         </w:rPr>
-        <w:lastRenderedPageBreak/>
         <w:t>Ethical Requirements:</w:t>
       </w:r>
     </w:p>
@@ -12124,6 +12142,7 @@
         <w:rPr>
           <w:lang w:val="en-PK"/>
         </w:rPr>
+        <w:lastRenderedPageBreak/>
         <w:t>Limitations</w:t>
       </w:r>
       <w:bookmarkEnd w:id="48"/>
@@ -12258,7 +12277,6 @@
       </w:pPr>
       <w:bookmarkStart w:id="53" w:name="_Toc231720960"/>
       <w:r>
-        <w:lastRenderedPageBreak/>
         <w:t>Conclusion</w:t>
       </w:r>
       <w:bookmarkEnd w:id="53"/>
@@ -12366,6 +12384,7 @@
         <w:rPr>
           <w:lang w:val="en-PK"/>
         </w:rPr>
+        <w:lastRenderedPageBreak/>
         <w:t>Lessons Learned</w:t>
       </w:r>
       <w:bookmarkEnd w:id="55"/>
@@ -12394,7 +12413,7 @@
           <w:lang w:val="en-PK"/>
         </w:rPr>
         <w:pict w14:anchorId="0B7CB3B0">
-          <v:rect id="_x0000_i1371" style="width:0;height:1.5pt" o:hralign="center" o:hrstd="t" o:hr="t" fillcolor="#a0a0a0" stroked="f"/>
+          <v:rect id="_x0000_i1025" style="width:0;height:1.5pt" o:hralign="center" o:hrstd="t" o:hr="t" fillcolor="#a0a0a0" stroked="f"/>
         </w:pict>
       </w:r>
     </w:p>
@@ -12443,6 +12462,7 @@
           <w:ilvl w:val="0"/>
           <w:numId w:val="20"/>
         </w:numPr>
+        <w:jc w:val="left"/>
         <w:rPr>
           <w:lang w:val="en-PK"/>
         </w:rPr>
@@ -12474,6 +12494,7 @@
           <w:ilvl w:val="0"/>
           <w:numId w:val="20"/>
         </w:numPr>
+        <w:jc w:val="left"/>
         <w:rPr>
           <w:lang w:val="en-PK"/>
         </w:rPr>
@@ -12505,6 +12526,7 @@
           <w:ilvl w:val="0"/>
           <w:numId w:val="20"/>
         </w:numPr>
+        <w:jc w:val="left"/>
         <w:rPr>
           <w:lang w:val="en-PK"/>
         </w:rPr>
@@ -12531,6 +12553,7 @@
           <w:ilvl w:val="0"/>
           <w:numId w:val="20"/>
         </w:numPr>
+        <w:jc w:val="left"/>
         <w:rPr>
           <w:lang w:val="en-PK"/>
         </w:rPr>
@@ -12557,6 +12580,7 @@
           <w:ilvl w:val="0"/>
           <w:numId w:val="20"/>
         </w:numPr>
+        <w:jc w:val="left"/>
         <w:rPr>
           <w:lang w:val="en-PK"/>
         </w:rPr>
@@ -15118,6 +15142,7 @@
   <w:style w:type="character" w:default="1" w:styleId="DefaultParagraphFont">
     <w:name w:val="Default Paragraph Font"/>
     <w:uiPriority w:val="1"/>
+    <w:semiHidden/>
     <w:unhideWhenUsed/>
   </w:style>
   <w:style w:type="table" w:default="1" w:styleId="TableNormal">

</xml_diff>